<commit_message>
fix fake dept names
</commit_message>
<xml_diff>
--- a/docs/Cascading_Exit_Risk_Analysis_EN.docx
+++ b/docs/Cascading_Exit_Risk_Analysis_EN.docx
@@ -3475,7 +3475,7 @@
         <w:t xml:space="preserve">Solution 3: Post-Exit 30-Day Peer Wellbeing Pulse Check. </w:t>
       </w:r>
       <w:r>
-        <w:t>Conduct a lightweight, anonymous wellbeing survey of all remaining team members at the 30-day mark following any regrettable exit. The survey measures workload perception, morale, and intent-to-stay. Results with a wellbeing delta worse than -0.15 trigger an escalation to HR Business Partner for intervention. This provides an early warning system for the secondary flight risk observed in Case E07625.</w:t>
+        <w:t>Conduct a lightweight, anonymous wellbeing survey of all remaining team members at the 30-day mark following any regrettable exit. The survey measures workload perception, morale, and intent-to-stay. Results with a wellbeing delta worse than -0.15 trigger an escalation to Risk &amp; Compliance Business Partner for intervention. This provides an early warning system for the secondary flight risk observed in Case E07625.</w:t>
       </w:r>
     </w:p>
     <w:p>
@@ -3518,7 +3518,7 @@
           <w:color w:val="999999"/>
           <w:sz w:val="18"/>
         </w:rPr>
-        <w:t>Data sourced from internal HRIS, engagement survey platform, and manager self-assessments. Wellbeing scores on a 1-5 standardized scale. Manager effectiveness measured via composite index of team output, escalation rate, and direct-report feedback. Analysis period covers 30 days pre-exit to 60 days post-exit for each case.</w:t>
+        <w:t>Data sourced from WorkdayHR, engagement survey platform, and manager self-assessments. Wellbeing scores on a 1-5 standardized scale. Manager effectiveness measured via composite index of team output, escalation rate, and direct-report feedback. Analysis period covers 30 days pre-exit to 60 days post-exit for each case.</w:t>
       </w:r>
     </w:p>
     <w:sectPr>

</xml_diff>